<commit_message>
docs: record IELTS writing fix deployment
</commit_message>
<xml_diff>
--- a/jackyun-portal/docs/ielts-writing-save-fix-3.60.5/任务说明.docx
+++ b/jackyun-portal/docs/ielts-writing-save-fix-3.60.5/任务说明.docx
@@ -423,12 +423,12 @@
     </w:p>
     <w:p>
       <w:r>
-        <w:t>代码以远端 Main 对应的 3.60.4 版本为基线，而不是落后的本地 checkout。该修复属于小问题修复，按仓库版本规则将最后一位加一至 3.60.5，并同步更新 package.json、package-lock.json 与更新历史。原工作区包含许多与本任务无关的未提交改动，本次修改在独立工作树和功能分支中完成，不改动或清理原工作区内容。</w:t>
+        <w:t>修复以远端 Main 的 3.60.4 为基线，按小问题修复规则升至 3.60.5，并同步 package.json、package-lock.json 与更新历史。原工作区包含大量无关未提交改动，因此在隔离工作树中实施；最终提交 df9f8df56205ef91619015abc708ca674030bc53 已快进合入 Main。</w:t>
       </w:r>
     </w:p>
     <w:p>
       <w:r>
-        <w:t>变更将通过 GitHub 合并到 Main。合并后查看 Vercel 对应提交的构建和部署状态，并核实生产页面更新；PR 创建或合并成功本身不作为部署完成的证明。部署状态将在最终交付前补记。</w:t>
+        <w:t>Main 更新后检查了该提交的构建和部署状态，并直接请求生产健康接口和雅思写作路由；检查结果记于第六节。</w:t>
       </w:r>
     </w:p>
     <w:p>
@@ -482,6 +482,50 @@
       </w:pPr>
       <w:r>
         <w:t>package.json 与 package-lock.json 的顶层版本均为 3.60.5；Main 合并提交对应的 Vercel 生产部署已达到 READY。</w:t>
+      </w:r>
+    </w:p>
+    <w:p>
+      <w:pPr>
+        <w:pStyle w:val="Heading1"/>
+      </w:pPr>
+      <w:r>
+        <w:t>六 最终验证结果</w:t>
+      </w:r>
+    </w:p>
+    <w:p>
+      <w:pPr>
+        <w:pStyle w:val="ListBullet"/>
+        <w:ind w:left="320" w:hanging="180"/>
+      </w:pPr>
+      <w:r>
+        <w:t>代码与发布：Main 当前包含提交 df9f8df56205ef91619015abc708ca674030bc53。GitHub 对该提交的 build、deploy 和 Cloudflare Pages 检查均为 completed / success。</w:t>
+      </w:r>
+    </w:p>
+    <w:p>
+      <w:pPr>
+        <w:pStyle w:val="ListBullet"/>
+        <w:ind w:left="320" w:hanging="180"/>
+      </w:pPr>
+      <w:r>
+        <w:t>生产检查：GET /api/health 返回 HTTP 200 且状态为 ok；GET /ielts-writing?cloud_off 返回 HTTP 200。生产主机实际发布检查由 Cloudflare Pages 提供。</w:t>
+      </w:r>
+    </w:p>
+    <w:p>
+      <w:pPr>
+        <w:pStyle w:val="ListBullet"/>
+        <w:ind w:left="320" w:hanging="180"/>
+      </w:pPr>
+      <w:r>
+        <w:t>静态核对：package.json 和 package-lock.json 顶层版本一致为 3.60.5；写作工作台不再直接调用 localStorage；git diff --check 通过。未在本地运行浏览器回归或手工模拟配额故障。</w:t>
+      </w:r>
+    </w:p>
+    <w:p>
+      <w:pPr>
+        <w:pStyle w:val="ListBullet"/>
+        <w:ind w:left="320" w:hanging="180"/>
+      </w:pPr>
+      <w:r>
+        <w:t>DOCX 版面：已用 python-docx 读取并校验正文与版本字段。打包的 render_docx.py 因环境未提供 soffice.exe 而失败；Word COM 导出也因隔离登录会话不存在而无法启动，因此本文件的分页与视觉版面未得到渲染检查。</w:t>
       </w:r>
     </w:p>
     <w:sectPr>

</xml_diff>